<commit_message>
Added InfSecurity and SIAOD lab3 beta
</commit_message>
<xml_diff>
--- a/Network/lab2/lab2.docx
+++ b/Network/lab2/lab2.docx
@@ -252,7 +252,15 @@
           <w:sz w:val="28"/>
           <w:szCs w:val="28"/>
         </w:rPr>
-        <w:t>Разбиение сети на подсети с использованием масок постоянной и переменной среды</w:t>
+        <w:t xml:space="preserve">Разбиение сети на подсети с использованием масок постоянной и переменной </w:t>
+      </w:r>
+      <w:r>
+        <w:rPr>
+          <w:rFonts w:ascii="Times New Roman" w:hAnsi="Times New Roman" w:cs="Times New Roman"/>
+          <w:sz w:val="28"/>
+          <w:szCs w:val="28"/>
+        </w:rPr>
+        <w:t>длины</w:t>
       </w:r>
       <w:r>
         <w:rPr>
@@ -325,13 +333,23 @@
         </w:rPr>
         <w:br/>
       </w:r>
-      <w:r>
-        <w:rPr>
-          <w:rFonts w:ascii="Times New Roman" w:hAnsi="Times New Roman" w:cs="Times New Roman"/>
-          <w:sz w:val="28"/>
-          <w:szCs w:val="28"/>
-        </w:rPr>
-        <w:t>Аралушкин М.Д.</w:t>
+      <w:proofErr w:type="spellStart"/>
+      <w:r>
+        <w:rPr>
+          <w:rFonts w:ascii="Times New Roman" w:hAnsi="Times New Roman" w:cs="Times New Roman"/>
+          <w:sz w:val="28"/>
+          <w:szCs w:val="28"/>
+        </w:rPr>
+        <w:t>Аралушкин</w:t>
+      </w:r>
+      <w:proofErr w:type="spellEnd"/>
+      <w:r>
+        <w:rPr>
+          <w:rFonts w:ascii="Times New Roman" w:hAnsi="Times New Roman" w:cs="Times New Roman"/>
+          <w:sz w:val="28"/>
+          <w:szCs w:val="28"/>
+        </w:rPr>
+        <w:t xml:space="preserve"> М.Д.</w:t>
       </w:r>
     </w:p>
     <w:p>
@@ -350,24 +368,7 @@
           <w:sz w:val="28"/>
           <w:szCs w:val="28"/>
         </w:rPr>
-        <w:t>Проверил</w:t>
-      </w:r>
-      <w:r>
-        <w:rPr>
-          <w:rFonts w:ascii="Times New Roman" w:hAnsi="Times New Roman" w:cs="Times New Roman"/>
-          <w:sz w:val="28"/>
-          <w:szCs w:val="28"/>
-        </w:rPr>
-        <w:t>:</w:t>
-      </w:r>
-      <w:r>
-        <w:rPr>
-          <w:rFonts w:ascii="Times New Roman" w:hAnsi="Times New Roman" w:cs="Times New Roman"/>
-          <w:sz w:val="28"/>
-          <w:szCs w:val="28"/>
-        </w:rPr>
-        <w:br/>
-        <w:t>Борзов В.М.</w:t>
+        <w:t xml:space="preserve"> </w:t>
       </w:r>
     </w:p>
     <w:p>
@@ -380,6 +381,17 @@
           <w:szCs w:val="28"/>
         </w:rPr>
       </w:pPr>
+    </w:p>
+    <w:p>
+      <w:pPr>
+        <w:spacing w:line="360" w:lineRule="auto"/>
+        <w:jc w:val="right"/>
+        <w:rPr>
+          <w:rFonts w:ascii="Times New Roman" w:hAnsi="Times New Roman" w:cs="Times New Roman"/>
+          <w:sz w:val="28"/>
+          <w:szCs w:val="28"/>
+        </w:rPr>
+      </w:pPr>
       <w:r>
         <w:rPr>
           <w:rFonts w:ascii="Times New Roman" w:hAnsi="Times New Roman" w:cs="Times New Roman"/>
@@ -525,15 +537,6 @@
     </w:p>
     <w:p>
       <w:pPr>
-        <w:rPr>
-          <w:rFonts w:ascii="Times New Roman" w:hAnsi="Times New Roman" w:cs="Times New Roman"/>
-          <w:sz w:val="28"/>
-          <w:szCs w:val="28"/>
-        </w:rPr>
-      </w:pPr>
-    </w:p>
-    <w:p>
-      <w:pPr>
         <w:jc w:val="center"/>
         <w:rPr>
           <w:rFonts w:ascii="Times New Roman" w:hAnsi="Times New Roman" w:cs="Times New Roman"/>
@@ -642,24 +645,101 @@
           <w:sz w:val="28"/>
           <w:szCs w:val="28"/>
         </w:rPr>
-        <w:t xml:space="preserve">Для этого надо занять 2 бита из хостовой части. В итоге маска составит </w:t>
-      </w:r>
-      <w:r>
-        <w:rPr>
-          <w:rFonts w:ascii="Times New Roman" w:hAnsi="Times New Roman" w:cs="Times New Roman"/>
-          <w:sz w:val="28"/>
-          <w:szCs w:val="28"/>
+        <w:t xml:space="preserve">Для этого надо занять 2 бита из </w:t>
+      </w:r>
+      <w:proofErr w:type="spellStart"/>
+      <w:r>
+        <w:rPr>
+          <w:rFonts w:ascii="Times New Roman" w:hAnsi="Times New Roman" w:cs="Times New Roman"/>
+          <w:sz w:val="28"/>
+          <w:szCs w:val="28"/>
+        </w:rPr>
+        <w:t>хостовой</w:t>
+      </w:r>
+      <w:proofErr w:type="spellEnd"/>
+      <w:r>
+        <w:rPr>
+          <w:rFonts w:ascii="Times New Roman" w:hAnsi="Times New Roman" w:cs="Times New Roman"/>
+          <w:sz w:val="28"/>
+          <w:szCs w:val="28"/>
+        </w:rPr>
+        <w:t xml:space="preserve"> части. В итоге маска составит </w:t>
+      </w:r>
+      <w:r>
+        <w:rPr>
+          <w:rFonts w:ascii="Times New Roman" w:hAnsi="Times New Roman" w:cs="Times New Roman"/>
+          <w:sz w:val="28"/>
+          <w:szCs w:val="28"/>
+        </w:rPr>
+        <w:t>/20</w:t>
+      </w:r>
+      <w:r>
+        <w:rPr>
+          <w:rFonts w:ascii="Times New Roman" w:hAnsi="Times New Roman" w:cs="Times New Roman"/>
+          <w:sz w:val="28"/>
+          <w:szCs w:val="28"/>
+        </w:rPr>
+        <w:t xml:space="preserve"> (255.255.240.0). Строим таблицу:</w:t>
+      </w:r>
+    </w:p>
+    <w:p>
+      <w:pPr>
+        <w:rPr>
+          <w:rFonts w:ascii="Times New Roman" w:hAnsi="Times New Roman" w:cs="Times New Roman"/>
+        </w:rPr>
+      </w:pPr>
+      <w:r>
+        <w:rPr>
+          <w:rFonts w:ascii="Times New Roman" w:hAnsi="Times New Roman" w:cs="Times New Roman"/>
+          <w:sz w:val="28"/>
+          <w:szCs w:val="28"/>
+        </w:rPr>
+        <w:tab/>
+      </w:r>
+      <w:r>
+        <w:rPr>
+          <w:rFonts w:ascii="Times New Roman" w:hAnsi="Times New Roman" w:cs="Times New Roman"/>
+          <w:sz w:val="28"/>
+          <w:szCs w:val="28"/>
+        </w:rPr>
+        <w:tab/>
+      </w:r>
+      <w:r>
+        <w:rPr>
+          <w:rFonts w:ascii="Times New Roman" w:hAnsi="Times New Roman" w:cs="Times New Roman"/>
+        </w:rPr>
+        <w:t xml:space="preserve">Таблица 1 </w:t>
+      </w:r>
+      <w:r>
+        <w:rPr>
+          <w:rFonts w:ascii="Times New Roman" w:hAnsi="Times New Roman" w:cs="Times New Roman"/>
+        </w:rPr>
+        <w:t>–</w:t>
+      </w:r>
+      <w:r>
+        <w:rPr>
+          <w:rFonts w:ascii="Times New Roman" w:hAnsi="Times New Roman" w:cs="Times New Roman"/>
+        </w:rPr>
+        <w:t xml:space="preserve"> </w:t>
+      </w:r>
+      <w:r>
+        <w:rPr>
+          <w:rFonts w:ascii="Times New Roman" w:hAnsi="Times New Roman" w:cs="Times New Roman"/>
           <w:lang w:val="en-US"/>
         </w:rPr>
-        <w:t>/20</w:t>
-      </w:r>
-      <w:r>
-        <w:rPr>
-          <w:rFonts w:ascii="Times New Roman" w:hAnsi="Times New Roman" w:cs="Times New Roman"/>
-          <w:sz w:val="28"/>
-          <w:szCs w:val="28"/>
-        </w:rPr>
-        <w:t xml:space="preserve"> (255.255.240.0). Строим таблицу:</w:t>
+        <w:t>IP</w:t>
+      </w:r>
+      <w:r>
+        <w:rPr>
+          <w:rFonts w:ascii="Times New Roman" w:hAnsi="Times New Roman" w:cs="Times New Roman"/>
+        </w:rPr>
+        <w:t xml:space="preserve"> </w:t>
+      </w:r>
+      <w:r>
+        <w:rPr>
+          <w:rFonts w:ascii="Times New Roman" w:hAnsi="Times New Roman" w:cs="Times New Roman"/>
+        </w:rPr>
+        <w:t>с постоянными масками</w:t>
       </w:r>
     </w:p>
     <w:tbl>
@@ -1856,7 +1936,6 @@
           <w:rFonts w:ascii="Times New Roman" w:hAnsi="Times New Roman" w:cs="Times New Roman"/>
           <w:sz w:val="28"/>
           <w:szCs w:val="28"/>
-          <w:lang w:val="en-US"/>
         </w:rPr>
       </w:pPr>
       <w:r>
@@ -2107,7 +2186,25 @@
           <w:sz w:val="28"/>
           <w:szCs w:val="28"/>
         </w:rPr>
-        <w:t>Проверил пинг:</w:t>
+        <w:t xml:space="preserve">Проверил </w:t>
+      </w:r>
+      <w:proofErr w:type="spellStart"/>
+      <w:r>
+        <w:rPr>
+          <w:rFonts w:ascii="Times New Roman" w:hAnsi="Times New Roman" w:cs="Times New Roman"/>
+          <w:sz w:val="28"/>
+          <w:szCs w:val="28"/>
+        </w:rPr>
+        <w:t>пинг</w:t>
+      </w:r>
+      <w:proofErr w:type="spellEnd"/>
+      <w:r>
+        <w:rPr>
+          <w:rFonts w:ascii="Times New Roman" w:hAnsi="Times New Roman" w:cs="Times New Roman"/>
+          <w:sz w:val="28"/>
+          <w:szCs w:val="28"/>
+        </w:rPr>
+        <w:t>:</w:t>
       </w:r>
     </w:p>
     <w:p>
@@ -2545,7 +2642,6 @@
           <w:bCs/>
           <w:sz w:val="28"/>
           <w:szCs w:val="28"/>
-          <w:lang w:val="en-US"/>
         </w:rPr>
       </w:pPr>
       <w:r>
@@ -2946,6 +3042,54 @@
         </w:rPr>
         <w:lastRenderedPageBreak/>
         <w:t>Строим таблицу:</w:t>
+      </w:r>
+    </w:p>
+    <w:p>
+      <w:pPr>
+        <w:rPr>
+          <w:rFonts w:ascii="Times New Roman" w:hAnsi="Times New Roman" w:cs="Times New Roman"/>
+        </w:rPr>
+      </w:pPr>
+      <w:r>
+        <w:rPr>
+          <w:rFonts w:ascii="Times New Roman" w:hAnsi="Times New Roman" w:cs="Times New Roman"/>
+          <w:sz w:val="28"/>
+          <w:szCs w:val="28"/>
+        </w:rPr>
+        <w:tab/>
+      </w:r>
+      <w:r>
+        <w:rPr>
+          <w:rFonts w:ascii="Times New Roman" w:hAnsi="Times New Roman" w:cs="Times New Roman"/>
+          <w:sz w:val="28"/>
+          <w:szCs w:val="28"/>
+        </w:rPr>
+        <w:tab/>
+      </w:r>
+      <w:r>
+        <w:rPr>
+          <w:rFonts w:ascii="Times New Roman" w:hAnsi="Times New Roman" w:cs="Times New Roman"/>
+        </w:rPr>
+        <w:t xml:space="preserve">Таблица 2 – </w:t>
+      </w:r>
+      <w:r>
+        <w:rPr>
+          <w:rFonts w:ascii="Times New Roman" w:hAnsi="Times New Roman" w:cs="Times New Roman"/>
+          <w:lang w:val="en-US"/>
+        </w:rPr>
+        <w:t>IP</w:t>
+      </w:r>
+      <w:r>
+        <w:rPr>
+          <w:rFonts w:ascii="Times New Roman" w:hAnsi="Times New Roman" w:cs="Times New Roman"/>
+        </w:rPr>
+        <w:t xml:space="preserve"> </w:t>
+      </w:r>
+      <w:r>
+        <w:rPr>
+          <w:rFonts w:ascii="Times New Roman" w:hAnsi="Times New Roman" w:cs="Times New Roman"/>
+        </w:rPr>
+        <w:t>адрес с переменными масками</w:t>
       </w:r>
     </w:p>
     <w:tbl>
@@ -3856,15 +4000,7 @@
           <w:sz w:val="28"/>
           <w:szCs w:val="28"/>
         </w:rPr>
-        <w:t xml:space="preserve">После расчётов построил </w:t>
-      </w:r>
-      <w:r>
-        <w:rPr>
-          <w:rFonts w:ascii="Times New Roman" w:hAnsi="Times New Roman" w:cs="Times New Roman"/>
-          <w:sz w:val="28"/>
-          <w:szCs w:val="28"/>
-        </w:rPr>
-        <w:t xml:space="preserve">вторую топологию сети, состоящую из </w:t>
+        <w:t xml:space="preserve">После расчётов построил вторую топологию сети, состоящую из </w:t>
       </w:r>
       <w:r>
         <w:rPr>
@@ -3924,9 +4060,9 @@
           <w:noProof/>
         </w:rPr>
         <w:drawing>
-          <wp:inline distT="0" distB="0" distL="0" distR="0" wp14:anchorId="0144FD66" wp14:editId="6B0DD961">
-            <wp:extent cx="4053348" cy="3238500"/>
-            <wp:effectExtent l="0" t="0" r="4445" b="0"/>
+          <wp:inline distT="0" distB="0" distL="0" distR="0" wp14:anchorId="0144FD66" wp14:editId="6D1603A9">
+            <wp:extent cx="3665896" cy="2928938"/>
+            <wp:effectExtent l="0" t="0" r="0" b="5080"/>
             <wp:docPr id="696623891" name="Рисунок 1"/>
             <wp:cNvGraphicFramePr>
               <a:graphicFrameLocks xmlns:a="http://schemas.openxmlformats.org/drawingml/2006/main" noChangeAspect="1"/>
@@ -3947,7 +4083,7 @@
                   <pic:spPr>
                     <a:xfrm>
                       <a:off x="0" y="0"/>
-                      <a:ext cx="4066205" cy="3248773"/>
+                      <a:ext cx="3697483" cy="2954175"/>
                     </a:xfrm>
                     <a:prstGeom prst="rect">
                       <a:avLst/>
@@ -4073,39 +4209,38 @@
         <w:jc w:val="center"/>
         <w:rPr>
           <w:rFonts w:ascii="Times New Roman" w:hAnsi="Times New Roman" w:cs="Times New Roman"/>
+        </w:rPr>
+      </w:pPr>
+      <w:r>
+        <w:rPr>
+          <w:rFonts w:ascii="Times New Roman" w:hAnsi="Times New Roman" w:cs="Times New Roman"/>
+        </w:rPr>
+        <w:t xml:space="preserve">Рис. 6 – Пример ввода </w:t>
+      </w:r>
+      <w:r>
+        <w:rPr>
+          <w:rFonts w:ascii="Times New Roman" w:hAnsi="Times New Roman" w:cs="Times New Roman"/>
           <w:lang w:val="en-US"/>
         </w:rPr>
-      </w:pPr>
-      <w:r>
-        <w:rPr>
-          <w:rFonts w:ascii="Times New Roman" w:hAnsi="Times New Roman" w:cs="Times New Roman"/>
-        </w:rPr>
-        <w:t xml:space="preserve">Рис. 6 – Пример ввода </w:t>
+        <w:t>IP</w:t>
+      </w:r>
+      <w:r>
+        <w:rPr>
+          <w:rFonts w:ascii="Times New Roman" w:hAnsi="Times New Roman" w:cs="Times New Roman"/>
+        </w:rPr>
+        <w:t xml:space="preserve"> </w:t>
+      </w:r>
+      <w:r>
+        <w:rPr>
+          <w:rFonts w:ascii="Times New Roman" w:hAnsi="Times New Roman" w:cs="Times New Roman"/>
+        </w:rPr>
+        <w:t xml:space="preserve">и Маски в </w:t>
       </w:r>
       <w:r>
         <w:rPr>
           <w:rFonts w:ascii="Times New Roman" w:hAnsi="Times New Roman" w:cs="Times New Roman"/>
           <w:lang w:val="en-US"/>
         </w:rPr>
-        <w:t>IP</w:t>
-      </w:r>
-      <w:r>
-        <w:rPr>
-          <w:rFonts w:ascii="Times New Roman" w:hAnsi="Times New Roman" w:cs="Times New Roman"/>
-        </w:rPr>
-        <w:t xml:space="preserve"> </w:t>
-      </w:r>
-      <w:r>
-        <w:rPr>
-          <w:rFonts w:ascii="Times New Roman" w:hAnsi="Times New Roman" w:cs="Times New Roman"/>
-        </w:rPr>
-        <w:t xml:space="preserve">и Маски в </w:t>
-      </w:r>
-      <w:r>
-        <w:rPr>
-          <w:rFonts w:ascii="Times New Roman" w:hAnsi="Times New Roman" w:cs="Times New Roman"/>
-          <w:lang w:val="en-US"/>
-        </w:rPr>
         <w:t>PC</w:t>
       </w:r>
       <w:r>
@@ -4129,7 +4264,25 @@
           <w:sz w:val="28"/>
           <w:szCs w:val="28"/>
         </w:rPr>
-        <w:t>Проверяем пинг:</w:t>
+        <w:t xml:space="preserve">Проверяем </w:t>
+      </w:r>
+      <w:proofErr w:type="spellStart"/>
+      <w:r>
+        <w:rPr>
+          <w:rFonts w:ascii="Times New Roman" w:hAnsi="Times New Roman" w:cs="Times New Roman"/>
+          <w:sz w:val="28"/>
+          <w:szCs w:val="28"/>
+        </w:rPr>
+        <w:t>пинг</w:t>
+      </w:r>
+      <w:proofErr w:type="spellEnd"/>
+      <w:r>
+        <w:rPr>
+          <w:rFonts w:ascii="Times New Roman" w:hAnsi="Times New Roman" w:cs="Times New Roman"/>
+          <w:sz w:val="28"/>
+          <w:szCs w:val="28"/>
+        </w:rPr>
+        <w:t>:</w:t>
       </w:r>
     </w:p>
     <w:p>
@@ -4194,19 +4347,7 @@
         <w:rPr>
           <w:rFonts w:ascii="Times New Roman" w:hAnsi="Times New Roman" w:cs="Times New Roman"/>
         </w:rPr>
-        <w:t xml:space="preserve">Рис. </w:t>
-      </w:r>
-      <w:r>
-        <w:rPr>
-          <w:rFonts w:ascii="Times New Roman" w:hAnsi="Times New Roman" w:cs="Times New Roman"/>
-        </w:rPr>
-        <w:t>7</w:t>
-      </w:r>
-      <w:r>
-        <w:rPr>
-          <w:rFonts w:ascii="Times New Roman" w:hAnsi="Times New Roman" w:cs="Times New Roman"/>
-        </w:rPr>
-        <w:t xml:space="preserve"> – Проверка доступа от </w:t>
+        <w:t xml:space="preserve">Рис. 7 – Проверка доступа от </w:t>
       </w:r>
       <w:r>
         <w:rPr>
@@ -4307,19 +4448,7 @@
         <w:rPr>
           <w:rFonts w:ascii="Times New Roman" w:hAnsi="Times New Roman" w:cs="Times New Roman"/>
         </w:rPr>
-        <w:t xml:space="preserve">Рис. </w:t>
-      </w:r>
-      <w:r>
-        <w:rPr>
-          <w:rFonts w:ascii="Times New Roman" w:hAnsi="Times New Roman" w:cs="Times New Roman"/>
-        </w:rPr>
-        <w:t>8</w:t>
-      </w:r>
-      <w:r>
-        <w:rPr>
-          <w:rFonts w:ascii="Times New Roman" w:hAnsi="Times New Roman" w:cs="Times New Roman"/>
-        </w:rPr>
-        <w:t xml:space="preserve"> – Проверка доступа от </w:t>
+        <w:t xml:space="preserve">Рис. 8 – Проверка доступа от </w:t>
       </w:r>
       <w:r>
         <w:rPr>
@@ -4450,47 +4579,7 @@
           <w:szCs w:val="28"/>
         </w:rPr>
         <w:tab/>
-        <w:t>В ходе выполнения данной лабораторной работы я и</w:t>
-      </w:r>
-      <w:r>
-        <w:rPr>
-          <w:rFonts w:ascii="Times New Roman" w:hAnsi="Times New Roman" w:cs="Times New Roman"/>
-          <w:sz w:val="28"/>
-          <w:szCs w:val="28"/>
-        </w:rPr>
-        <w:t>зучи</w:t>
-      </w:r>
-      <w:r>
-        <w:rPr>
-          <w:rFonts w:ascii="Times New Roman" w:hAnsi="Times New Roman" w:cs="Times New Roman"/>
-          <w:sz w:val="28"/>
-          <w:szCs w:val="28"/>
-        </w:rPr>
-        <w:t>л</w:t>
-      </w:r>
-      <w:r>
-        <w:rPr>
-          <w:rFonts w:ascii="Times New Roman" w:hAnsi="Times New Roman" w:cs="Times New Roman"/>
-          <w:sz w:val="28"/>
-          <w:szCs w:val="28"/>
-        </w:rPr>
-        <w:t xml:space="preserve"> принципы разбиения сетей на подсети с использованием масок постоянной и переменной длины, рассмотре</w:t>
-      </w:r>
-      <w:r>
-        <w:rPr>
-          <w:rFonts w:ascii="Times New Roman" w:hAnsi="Times New Roman" w:cs="Times New Roman"/>
-          <w:sz w:val="28"/>
-          <w:szCs w:val="28"/>
-        </w:rPr>
-        <w:t>л</w:t>
-      </w:r>
-      <w:r>
-        <w:rPr>
-          <w:rFonts w:ascii="Times New Roman" w:hAnsi="Times New Roman" w:cs="Times New Roman"/>
-          <w:sz w:val="28"/>
-          <w:szCs w:val="28"/>
-        </w:rPr>
-        <w:t xml:space="preserve"> реализацию этих принципов с</w:t>
+        <w:t>В ходе выполнения данной лабораторной работы я изучил принципы разбиения сетей на подсети с использованием масок постоянной и переменной длины, рассмотрел реализацию этих принципов с</w:t>
       </w:r>
       <w:r>
         <w:rPr>
@@ -4506,55 +4595,7 @@
           <w:sz w:val="28"/>
           <w:szCs w:val="28"/>
         </w:rPr>
-        <w:t>использованием симулятора компьютерных сетей. Собра</w:t>
-      </w:r>
-      <w:r>
-        <w:rPr>
-          <w:rFonts w:ascii="Times New Roman" w:hAnsi="Times New Roman" w:cs="Times New Roman"/>
-          <w:sz w:val="28"/>
-          <w:szCs w:val="28"/>
-        </w:rPr>
-        <w:t>л</w:t>
-      </w:r>
-      <w:r>
-        <w:rPr>
-          <w:rFonts w:ascii="Times New Roman" w:hAnsi="Times New Roman" w:cs="Times New Roman"/>
-          <w:sz w:val="28"/>
-          <w:szCs w:val="28"/>
-        </w:rPr>
-        <w:t xml:space="preserve"> в соответствии с заданием топологии сетей, запусти</w:t>
-      </w:r>
-      <w:r>
-        <w:rPr>
-          <w:rFonts w:ascii="Times New Roman" w:hAnsi="Times New Roman" w:cs="Times New Roman"/>
-          <w:sz w:val="28"/>
-          <w:szCs w:val="28"/>
-        </w:rPr>
-        <w:t>л</w:t>
-      </w:r>
-      <w:r>
-        <w:rPr>
-          <w:rFonts w:ascii="Times New Roman" w:hAnsi="Times New Roman" w:cs="Times New Roman"/>
-          <w:sz w:val="28"/>
-          <w:szCs w:val="28"/>
-        </w:rPr>
-        <w:t xml:space="preserve"> и настрои</w:t>
-      </w:r>
-      <w:r>
-        <w:rPr>
-          <w:rFonts w:ascii="Times New Roman" w:hAnsi="Times New Roman" w:cs="Times New Roman"/>
-          <w:sz w:val="28"/>
-          <w:szCs w:val="28"/>
-        </w:rPr>
-        <w:t>л</w:t>
-      </w:r>
-      <w:r>
-        <w:rPr>
-          <w:rFonts w:ascii="Times New Roman" w:hAnsi="Times New Roman" w:cs="Times New Roman"/>
-          <w:sz w:val="28"/>
-          <w:szCs w:val="28"/>
-        </w:rPr>
-        <w:t xml:space="preserve"> виртуальное оборудование.</w:t>
+        <w:t>использованием симулятора компьютерных сетей. Собрал в соответствии с заданием топологии сетей, запустил и настроил виртуальное оборудование.</w:t>
       </w:r>
     </w:p>
     <w:p>
@@ -4698,7 +4739,43 @@
           <w:sz w:val="28"/>
           <w:szCs w:val="28"/>
         </w:rPr>
-        <w:t>Широковещательная рассылка (broadcast) — это метод передачи данных, при котором пакет отправляется всем узлам в пределах одной подсети. Широковещательный адрес формируется путем установки всех бит хостовой части IP-адреса в единицу</w:t>
+        <w:t>Широковещательная рассылка (</w:t>
+      </w:r>
+      <w:proofErr w:type="spellStart"/>
+      <w:r>
+        <w:rPr>
+          <w:rFonts w:ascii="Times New Roman" w:hAnsi="Times New Roman" w:cs="Times New Roman"/>
+          <w:sz w:val="28"/>
+          <w:szCs w:val="28"/>
+        </w:rPr>
+        <w:t>broadcast</w:t>
+      </w:r>
+      <w:proofErr w:type="spellEnd"/>
+      <w:r>
+        <w:rPr>
+          <w:rFonts w:ascii="Times New Roman" w:hAnsi="Times New Roman" w:cs="Times New Roman"/>
+          <w:sz w:val="28"/>
+          <w:szCs w:val="28"/>
+        </w:rPr>
+        <w:t xml:space="preserve">) — это метод передачи данных, при котором пакет отправляется всем узлам в пределах одной подсети. Широковещательный адрес формируется путем установки всех бит </w:t>
+      </w:r>
+      <w:proofErr w:type="spellStart"/>
+      <w:r>
+        <w:rPr>
+          <w:rFonts w:ascii="Times New Roman" w:hAnsi="Times New Roman" w:cs="Times New Roman"/>
+          <w:sz w:val="28"/>
+          <w:szCs w:val="28"/>
+        </w:rPr>
+        <w:t>хостовой</w:t>
+      </w:r>
+      <w:proofErr w:type="spellEnd"/>
+      <w:r>
+        <w:rPr>
+          <w:rFonts w:ascii="Times New Roman" w:hAnsi="Times New Roman" w:cs="Times New Roman"/>
+          <w:sz w:val="28"/>
+          <w:szCs w:val="28"/>
+        </w:rPr>
+        <w:t xml:space="preserve"> части IP-адреса в единицу</w:t>
       </w:r>
       <w:r>
         <w:rPr>
@@ -4769,34 +4846,9 @@
           <w:sz w:val="28"/>
           <w:szCs w:val="28"/>
         </w:rPr>
-        <w:t>Можно ли под адрес хоста использовать адрес, у которого вся хостовая часть заполнена нулями?</w:t>
-      </w:r>
-    </w:p>
-    <w:p>
-      <w:pPr>
-        <w:rPr>
-          <w:rFonts w:ascii="Times New Roman" w:hAnsi="Times New Roman" w:cs="Times New Roman"/>
-          <w:sz w:val="28"/>
-          <w:szCs w:val="28"/>
-        </w:rPr>
-      </w:pPr>
-      <w:r>
-        <w:rPr>
-          <w:rFonts w:ascii="Times New Roman" w:hAnsi="Times New Roman" w:cs="Times New Roman"/>
-          <w:sz w:val="28"/>
-          <w:szCs w:val="28"/>
-        </w:rPr>
-        <w:t xml:space="preserve">Нет, поскольку адрес, состоящий только из нулей в хостовой части, является идентификатором самой сети и не присваивается конкретным узлам. </w:t>
-      </w:r>
-    </w:p>
-    <w:p>
-      <w:pPr>
-        <w:rPr>
-          <w:rFonts w:ascii="Times New Roman" w:hAnsi="Times New Roman" w:cs="Times New Roman"/>
-          <w:sz w:val="28"/>
-          <w:szCs w:val="28"/>
-        </w:rPr>
-      </w:pPr>
+        <w:t xml:space="preserve">Можно ли под адрес хоста использовать адрес, у которого вся </w:t>
+      </w:r>
+      <w:proofErr w:type="spellStart"/>
       <w:r>
         <w:rPr>
           <w:rFonts w:ascii="Times New Roman" w:hAnsi="Times New Roman" w:cs="Times New Roman"/>
@@ -4805,50 +4857,9 @@
           <w:sz w:val="28"/>
           <w:szCs w:val="28"/>
         </w:rPr>
-        <w:t>Сколько хостов в сети 192.168.0.0/28?</w:t>
-      </w:r>
-    </w:p>
-    <w:p>
-      <w:pPr>
-        <w:rPr>
-          <w:rFonts w:ascii="Times New Roman" w:hAnsi="Times New Roman" w:cs="Times New Roman"/>
-          <w:sz w:val="28"/>
-          <w:szCs w:val="28"/>
-        </w:rPr>
-      </w:pPr>
-      <w:r>
-        <w:rPr>
-          <w:rFonts w:ascii="Times New Roman" w:hAnsi="Times New Roman" w:cs="Times New Roman"/>
-          <w:sz w:val="28"/>
-          <w:szCs w:val="28"/>
-        </w:rPr>
-        <w:t xml:space="preserve">14 хостов (под хостовую часть остается 4 бита: 2 </w:t>
-      </w:r>
-      <w:r>
-        <w:rPr>
-          <w:rFonts w:ascii="Times New Roman" w:hAnsi="Times New Roman" w:cs="Times New Roman"/>
-          <w:sz w:val="28"/>
-          <w:szCs w:val="28"/>
-        </w:rPr>
-        <w:t xml:space="preserve">^ </w:t>
-      </w:r>
-      <w:r>
-        <w:rPr>
-          <w:rFonts w:ascii="Times New Roman" w:hAnsi="Times New Roman" w:cs="Times New Roman"/>
-          <w:sz w:val="28"/>
-          <w:szCs w:val="28"/>
-        </w:rPr>
-        <w:t>4 = 16, минус 2 обязательных адреса для самой сети и широковещательной рассылки).</w:t>
-      </w:r>
-    </w:p>
-    <w:p>
-      <w:pPr>
-        <w:rPr>
-          <w:rFonts w:ascii="Times New Roman" w:hAnsi="Times New Roman" w:cs="Times New Roman"/>
-          <w:sz w:val="28"/>
-          <w:szCs w:val="28"/>
-        </w:rPr>
-      </w:pPr>
+        <w:t>хостовая</w:t>
+      </w:r>
+      <w:proofErr w:type="spellEnd"/>
       <w:r>
         <w:rPr>
           <w:rFonts w:ascii="Times New Roman" w:hAnsi="Times New Roman" w:cs="Times New Roman"/>
@@ -4857,24 +4868,42 @@
           <w:sz w:val="28"/>
           <w:szCs w:val="28"/>
         </w:rPr>
-        <w:t>С помощью какой команды можно задать IP адрес компьютеру в сети в операционной системе Windows (GNU Linux)?</w:t>
-      </w:r>
-    </w:p>
-    <w:p>
-      <w:pPr>
-        <w:rPr>
-          <w:rFonts w:ascii="Times New Roman" w:hAnsi="Times New Roman" w:cs="Times New Roman"/>
-          <w:sz w:val="28"/>
-          <w:szCs w:val="28"/>
-        </w:rPr>
-      </w:pPr>
-      <w:r>
-        <w:rPr>
-          <w:rFonts w:ascii="Times New Roman" w:hAnsi="Times New Roman" w:cs="Times New Roman"/>
-          <w:sz w:val="28"/>
-          <w:szCs w:val="28"/>
-        </w:rPr>
-        <w:t xml:space="preserve">В Windows из командной строки используется синтаксис ipconfig IP-address Mask, а в ОС Linux применяется команда ifconfig. </w:t>
+        <w:t xml:space="preserve"> часть заполнена нулями?</w:t>
+      </w:r>
+    </w:p>
+    <w:p>
+      <w:pPr>
+        <w:rPr>
+          <w:rFonts w:ascii="Times New Roman" w:hAnsi="Times New Roman" w:cs="Times New Roman"/>
+          <w:sz w:val="28"/>
+          <w:szCs w:val="28"/>
+        </w:rPr>
+      </w:pPr>
+      <w:r>
+        <w:rPr>
+          <w:rFonts w:ascii="Times New Roman" w:hAnsi="Times New Roman" w:cs="Times New Roman"/>
+          <w:sz w:val="28"/>
+          <w:szCs w:val="28"/>
+        </w:rPr>
+        <w:t xml:space="preserve">Нет, поскольку адрес, состоящий только из нулей в </w:t>
+      </w:r>
+      <w:proofErr w:type="spellStart"/>
+      <w:r>
+        <w:rPr>
+          <w:rFonts w:ascii="Times New Roman" w:hAnsi="Times New Roman" w:cs="Times New Roman"/>
+          <w:sz w:val="28"/>
+          <w:szCs w:val="28"/>
+        </w:rPr>
+        <w:t>хостовой</w:t>
+      </w:r>
+      <w:proofErr w:type="spellEnd"/>
+      <w:r>
+        <w:rPr>
+          <w:rFonts w:ascii="Times New Roman" w:hAnsi="Times New Roman" w:cs="Times New Roman"/>
+          <w:sz w:val="28"/>
+          <w:szCs w:val="28"/>
+        </w:rPr>
+        <w:t xml:space="preserve"> части, является идентификатором самой сети и не присваивается конкретным узлам. </w:t>
       </w:r>
     </w:p>
     <w:p>
@@ -4893,6 +4922,184 @@
           <w:sz w:val="28"/>
           <w:szCs w:val="28"/>
         </w:rPr>
+        <w:t>Сколько хостов в сети 192.168.0.0/28?</w:t>
+      </w:r>
+    </w:p>
+    <w:p>
+      <w:pPr>
+        <w:rPr>
+          <w:rFonts w:ascii="Times New Roman" w:hAnsi="Times New Roman" w:cs="Times New Roman"/>
+          <w:sz w:val="28"/>
+          <w:szCs w:val="28"/>
+        </w:rPr>
+      </w:pPr>
+      <w:r>
+        <w:rPr>
+          <w:rFonts w:ascii="Times New Roman" w:hAnsi="Times New Roman" w:cs="Times New Roman"/>
+          <w:sz w:val="28"/>
+          <w:szCs w:val="28"/>
+        </w:rPr>
+        <w:t xml:space="preserve">14 хостов (под </w:t>
+      </w:r>
+      <w:proofErr w:type="spellStart"/>
+      <w:r>
+        <w:rPr>
+          <w:rFonts w:ascii="Times New Roman" w:hAnsi="Times New Roman" w:cs="Times New Roman"/>
+          <w:sz w:val="28"/>
+          <w:szCs w:val="28"/>
+        </w:rPr>
+        <w:t>хостовую</w:t>
+      </w:r>
+      <w:proofErr w:type="spellEnd"/>
+      <w:r>
+        <w:rPr>
+          <w:rFonts w:ascii="Times New Roman" w:hAnsi="Times New Roman" w:cs="Times New Roman"/>
+          <w:sz w:val="28"/>
+          <w:szCs w:val="28"/>
+        </w:rPr>
+        <w:t xml:space="preserve"> часть остается 4 бита: 2 </w:t>
+      </w:r>
+      <w:r>
+        <w:rPr>
+          <w:rFonts w:ascii="Times New Roman" w:hAnsi="Times New Roman" w:cs="Times New Roman"/>
+          <w:sz w:val="28"/>
+          <w:szCs w:val="28"/>
+        </w:rPr>
+        <w:t xml:space="preserve">^ </w:t>
+      </w:r>
+      <w:r>
+        <w:rPr>
+          <w:rFonts w:ascii="Times New Roman" w:hAnsi="Times New Roman" w:cs="Times New Roman"/>
+          <w:sz w:val="28"/>
+          <w:szCs w:val="28"/>
+        </w:rPr>
+        <w:t>4 = 16, минус 2 обязательных адреса для самой сети и широковещательной рассылки).</w:t>
+      </w:r>
+    </w:p>
+    <w:p>
+      <w:pPr>
+        <w:rPr>
+          <w:rFonts w:ascii="Times New Roman" w:hAnsi="Times New Roman" w:cs="Times New Roman"/>
+          <w:sz w:val="28"/>
+          <w:szCs w:val="28"/>
+        </w:rPr>
+      </w:pPr>
+      <w:r>
+        <w:rPr>
+          <w:rFonts w:ascii="Times New Roman" w:hAnsi="Times New Roman" w:cs="Times New Roman"/>
+          <w:b/>
+          <w:bCs/>
+          <w:sz w:val="28"/>
+          <w:szCs w:val="28"/>
+        </w:rPr>
+        <w:t>С помощью какой команды можно задать IP адрес компьютеру в сети в операционной системе Windows (GNU Linux)?</w:t>
+      </w:r>
+    </w:p>
+    <w:p>
+      <w:pPr>
+        <w:rPr>
+          <w:rFonts w:ascii="Times New Roman" w:hAnsi="Times New Roman" w:cs="Times New Roman"/>
+          <w:sz w:val="28"/>
+          <w:szCs w:val="28"/>
+        </w:rPr>
+      </w:pPr>
+      <w:r>
+        <w:rPr>
+          <w:rFonts w:ascii="Times New Roman" w:hAnsi="Times New Roman" w:cs="Times New Roman"/>
+          <w:sz w:val="28"/>
+          <w:szCs w:val="28"/>
+        </w:rPr>
+        <w:t xml:space="preserve">В Windows из командной строки используется синтаксис </w:t>
+      </w:r>
+      <w:proofErr w:type="spellStart"/>
+      <w:r>
+        <w:rPr>
+          <w:rFonts w:ascii="Times New Roman" w:hAnsi="Times New Roman" w:cs="Times New Roman"/>
+          <w:sz w:val="28"/>
+          <w:szCs w:val="28"/>
+        </w:rPr>
+        <w:t>ipconfig</w:t>
+      </w:r>
+      <w:proofErr w:type="spellEnd"/>
+      <w:r>
+        <w:rPr>
+          <w:rFonts w:ascii="Times New Roman" w:hAnsi="Times New Roman" w:cs="Times New Roman"/>
+          <w:sz w:val="28"/>
+          <w:szCs w:val="28"/>
+        </w:rPr>
+        <w:t xml:space="preserve"> IP-</w:t>
+      </w:r>
+      <w:proofErr w:type="spellStart"/>
+      <w:r>
+        <w:rPr>
+          <w:rFonts w:ascii="Times New Roman" w:hAnsi="Times New Roman" w:cs="Times New Roman"/>
+          <w:sz w:val="28"/>
+          <w:szCs w:val="28"/>
+        </w:rPr>
+        <w:t>address</w:t>
+      </w:r>
+      <w:proofErr w:type="spellEnd"/>
+      <w:r>
+        <w:rPr>
+          <w:rFonts w:ascii="Times New Roman" w:hAnsi="Times New Roman" w:cs="Times New Roman"/>
+          <w:sz w:val="28"/>
+          <w:szCs w:val="28"/>
+        </w:rPr>
+        <w:t xml:space="preserve"> </w:t>
+      </w:r>
+      <w:proofErr w:type="spellStart"/>
+      <w:r>
+        <w:rPr>
+          <w:rFonts w:ascii="Times New Roman" w:hAnsi="Times New Roman" w:cs="Times New Roman"/>
+          <w:sz w:val="28"/>
+          <w:szCs w:val="28"/>
+        </w:rPr>
+        <w:t>Mask</w:t>
+      </w:r>
+      <w:proofErr w:type="spellEnd"/>
+      <w:r>
+        <w:rPr>
+          <w:rFonts w:ascii="Times New Roman" w:hAnsi="Times New Roman" w:cs="Times New Roman"/>
+          <w:sz w:val="28"/>
+          <w:szCs w:val="28"/>
+        </w:rPr>
+        <w:t xml:space="preserve">, а в ОС Linux применяется команда </w:t>
+      </w:r>
+      <w:proofErr w:type="spellStart"/>
+      <w:r>
+        <w:rPr>
+          <w:rFonts w:ascii="Times New Roman" w:hAnsi="Times New Roman" w:cs="Times New Roman"/>
+          <w:sz w:val="28"/>
+          <w:szCs w:val="28"/>
+        </w:rPr>
+        <w:t>ifconfig</w:t>
+      </w:r>
+      <w:proofErr w:type="spellEnd"/>
+      <w:r>
+        <w:rPr>
+          <w:rFonts w:ascii="Times New Roman" w:hAnsi="Times New Roman" w:cs="Times New Roman"/>
+          <w:sz w:val="28"/>
+          <w:szCs w:val="28"/>
+        </w:rPr>
+        <w:t xml:space="preserve">. </w:t>
+      </w:r>
+    </w:p>
+    <w:p>
+      <w:pPr>
+        <w:rPr>
+          <w:rFonts w:ascii="Times New Roman" w:hAnsi="Times New Roman" w:cs="Times New Roman"/>
+          <w:sz w:val="28"/>
+          <w:szCs w:val="28"/>
+        </w:rPr>
+      </w:pPr>
+      <w:r>
+        <w:rPr>
+          <w:rFonts w:ascii="Times New Roman" w:hAnsi="Times New Roman" w:cs="Times New Roman"/>
+          <w:b/>
+          <w:bCs/>
+          <w:sz w:val="28"/>
+          <w:szCs w:val="28"/>
+        </w:rPr>
         <w:lastRenderedPageBreak/>
         <w:t>Какое преимущество обеспечивает использование маски переменной длины?</w:t>
       </w:r>
@@ -4992,7 +5199,25 @@
           <w:sz w:val="28"/>
           <w:szCs w:val="28"/>
         </w:rPr>
-        <w:t xml:space="preserve">Он формируется путем заполнения единицами хостовой части сетевого адреса (той части, которая в маске подсети обозначена нулями). </w:t>
+        <w:t xml:space="preserve">Он формируется путем заполнения единицами </w:t>
+      </w:r>
+      <w:proofErr w:type="spellStart"/>
+      <w:r>
+        <w:rPr>
+          <w:rFonts w:ascii="Times New Roman" w:hAnsi="Times New Roman" w:cs="Times New Roman"/>
+          <w:sz w:val="28"/>
+          <w:szCs w:val="28"/>
+        </w:rPr>
+        <w:t>хостовой</w:t>
+      </w:r>
+      <w:proofErr w:type="spellEnd"/>
+      <w:r>
+        <w:rPr>
+          <w:rFonts w:ascii="Times New Roman" w:hAnsi="Times New Roman" w:cs="Times New Roman"/>
+          <w:sz w:val="28"/>
+          <w:szCs w:val="28"/>
+        </w:rPr>
+        <w:t xml:space="preserve"> части сетевого адреса (той части, которая в маске подсети обозначена нулями). </w:t>
       </w:r>
     </w:p>
     <w:p>
@@ -5028,7 +5253,25 @@
           <w:sz w:val="28"/>
           <w:szCs w:val="28"/>
         </w:rPr>
-        <w:t xml:space="preserve">Адрес каждой последующей сети получается путем прибавления единицы к широковещательному (broadcast) адресу предыдущей сети. </w:t>
+        <w:t>Адрес каждой последующей сети получается путем прибавления единицы к широковещательному (</w:t>
+      </w:r>
+      <w:proofErr w:type="spellStart"/>
+      <w:r>
+        <w:rPr>
+          <w:rFonts w:ascii="Times New Roman" w:hAnsi="Times New Roman" w:cs="Times New Roman"/>
+          <w:sz w:val="28"/>
+          <w:szCs w:val="28"/>
+        </w:rPr>
+        <w:t>broadcast</w:t>
+      </w:r>
+      <w:proofErr w:type="spellEnd"/>
+      <w:r>
+        <w:rPr>
+          <w:rFonts w:ascii="Times New Roman" w:hAnsi="Times New Roman" w:cs="Times New Roman"/>
+          <w:sz w:val="28"/>
+          <w:szCs w:val="28"/>
+        </w:rPr>
+        <w:t xml:space="preserve">) адресу предыдущей сети. </w:t>
       </w:r>
     </w:p>
     <w:p>
@@ -5072,8 +5315,72 @@
           <w:sz w:val="28"/>
           <w:szCs w:val="28"/>
         </w:rPr>
-        <w:t>, Variable Length Subnet Mask</w:t>
-      </w:r>
+        <w:t xml:space="preserve">, </w:t>
+      </w:r>
+      <w:proofErr w:type="spellStart"/>
+      <w:r>
+        <w:rPr>
+          <w:rFonts w:ascii="Times New Roman" w:hAnsi="Times New Roman" w:cs="Times New Roman"/>
+          <w:sz w:val="28"/>
+          <w:szCs w:val="28"/>
+        </w:rPr>
+        <w:t>Variable</w:t>
+      </w:r>
+      <w:proofErr w:type="spellEnd"/>
+      <w:r>
+        <w:rPr>
+          <w:rFonts w:ascii="Times New Roman" w:hAnsi="Times New Roman" w:cs="Times New Roman"/>
+          <w:sz w:val="28"/>
+          <w:szCs w:val="28"/>
+        </w:rPr>
+        <w:t xml:space="preserve"> </w:t>
+      </w:r>
+      <w:proofErr w:type="spellStart"/>
+      <w:r>
+        <w:rPr>
+          <w:rFonts w:ascii="Times New Roman" w:hAnsi="Times New Roman" w:cs="Times New Roman"/>
+          <w:sz w:val="28"/>
+          <w:szCs w:val="28"/>
+        </w:rPr>
+        <w:t>Length</w:t>
+      </w:r>
+      <w:proofErr w:type="spellEnd"/>
+      <w:r>
+        <w:rPr>
+          <w:rFonts w:ascii="Times New Roman" w:hAnsi="Times New Roman" w:cs="Times New Roman"/>
+          <w:sz w:val="28"/>
+          <w:szCs w:val="28"/>
+        </w:rPr>
+        <w:t xml:space="preserve"> </w:t>
+      </w:r>
+      <w:proofErr w:type="spellStart"/>
+      <w:r>
+        <w:rPr>
+          <w:rFonts w:ascii="Times New Roman" w:hAnsi="Times New Roman" w:cs="Times New Roman"/>
+          <w:sz w:val="28"/>
+          <w:szCs w:val="28"/>
+        </w:rPr>
+        <w:t>Subnet</w:t>
+      </w:r>
+      <w:proofErr w:type="spellEnd"/>
+      <w:r>
+        <w:rPr>
+          <w:rFonts w:ascii="Times New Roman" w:hAnsi="Times New Roman" w:cs="Times New Roman"/>
+          <w:sz w:val="28"/>
+          <w:szCs w:val="28"/>
+        </w:rPr>
+        <w:t xml:space="preserve"> </w:t>
+      </w:r>
+      <w:proofErr w:type="spellStart"/>
+      <w:r>
+        <w:rPr>
+          <w:rFonts w:ascii="Times New Roman" w:hAnsi="Times New Roman" w:cs="Times New Roman"/>
+          <w:sz w:val="28"/>
+          <w:szCs w:val="28"/>
+        </w:rPr>
+        <w:t>Mask</w:t>
+      </w:r>
+      <w:proofErr w:type="spellEnd"/>
       <w:r>
         <w:rPr>
           <w:rFonts w:ascii="Times New Roman" w:hAnsi="Times New Roman" w:cs="Times New Roman"/>
@@ -5725,6 +6032,7 @@
   <w:style w:type="character" w:default="1" w:styleId="a0">
     <w:name w:val="Default Paragraph Font"/>
     <w:uiPriority w:val="1"/>
+    <w:semiHidden/>
     <w:unhideWhenUsed/>
   </w:style>
   <w:style w:type="table" w:default="1" w:styleId="a1">

</xml_diff>